<commit_message>
fix(EP1): la figura del informe salia cortada
LibreOffice ignora la regla CSS "width" al convertir desde HTML y usa el tamano
intrinseco de la imagen en pixeles: 1000 px a 96 dpi son 26,5 cm, asi que
dibujaba el diagrama a 26,5 cm de ancho en una pagina de 21 cm. El borde derecho
caia en 812 pt de los 595 que mide la pagina: se perdian unos 5,5 cm de figura.

El tamano pasa a ir en los atributos width y height del <img>, que son los que
LibreOffice si respeta. De paso se aprovecha el ancho util: la figura pasa de los
13 cm que pedia el CSS a 16,0 x 11,2 cm, el maximo que cabe sin empujar el
informe a una sexta pagina. Comprobado en el PDF y en el .docx.

Verificado mirando la pagina renderizada, no solo las medidas: la figura entra
completa entre los margenes y el informe sigue en cinco paginas.
</commit_message>
<xml_diff>
--- a/informe/informe-ep1.docx
+++ b/informe/informe-ep1.docx
@@ -2374,7 +2374,7 @@
         <w:rPr/>
         <w:drawing>
           <wp:inline distT="0" distB="0" distL="0" distR="0">
-            <wp:extent cx="9525000" cy="6667500"/>
+            <wp:extent cx="5762625" cy="4038600"/>
             <wp:effectExtent l="0" t="0" r="0" b="0"/>
             <wp:docPr id="1" name="Image1" descr="Arquitectura de la solución"/>
             <wp:cNvGraphicFramePr>
@@ -2398,7 +2398,7 @@
                   <pic:spPr bwMode="auto">
                     <a:xfrm>
                       <a:off x="0" y="0"/>
-                      <a:ext cx="9525000" cy="6667500"/>
+                      <a:ext cx="5762625" cy="4038600"/>
                     </a:xfrm>
                     <a:prstGeom prst="rect">
                       <a:avLst/>

</xml_diff>